<commit_message>
Update US003 - API de Cupons.docx
</commit_message>
<xml_diff>
--- a/docs/US003 - API de Cupons.docx
+++ b/docs/US003 - API de Cupons.docx
@@ -1502,25 +1502,7 @@
                 <w:lang w:val="en-US"/>
               </w:rPr>
               <w:br/>
-              <w:t xml:space="preserve">                "description": "</w:t>
-            </w:r>
-            <w:proofErr w:type="spellStart"/>
-            <w:r>
-              <w:rPr>
-                <w:b/>
-                <w:bCs/>
-                <w:lang w:val="en-US"/>
-              </w:rPr>
-              <w:t>Cupom</w:t>
-            </w:r>
-            <w:proofErr w:type="spellEnd"/>
-            <w:r>
-              <w:rPr>
-                <w:b/>
-                <w:bCs/>
-                <w:lang w:val="en-US"/>
-              </w:rPr>
-              <w:t xml:space="preserve"> de </w:t>
+              <w:t xml:space="preserve">                "description": "Cupom de </w:t>
             </w:r>
             <w:proofErr w:type="spellStart"/>
             <w:r>

</xml_diff>